<commit_message>
ПЗ: remove invalid highlightCs tag (schema), stop tracking __pycache__
Co-Authored-By: Claude Sonnet 5.5 <noreply@anthropic.com>
Claude-Session: https://claude.ai/code/session_01GVqkJddKe6CucL3vgR8vdk
</commit_message>
<xml_diff>
--- a/docs/pz/Пояснительная_записка.docx
+++ b/docs/pz/Пояснительная_записка.docx
@@ -71,7 +71,6 @@
           <w:sz w:val="28"/>
           <w:szCs w:val="28"/>
           <w:highlight w:val="yellow"/>
-          <w:highlightCs w:val="yellow"/>
         </w:rPr>
         <w:t xml:space="preserve">[факультет — уточнить]</w:t>
       </w:r>
@@ -96,7 +95,6 @@
           <w:sz w:val="28"/>
           <w:szCs w:val="28"/>
           <w:highlight w:val="yellow"/>
-          <w:highlightCs w:val="yellow"/>
         </w:rPr>
         <w:t xml:space="preserve">[кафедра — уточнить]</w:t>
       </w:r>
@@ -198,7 +196,6 @@
           <w:sz w:val="28"/>
           <w:szCs w:val="28"/>
           <w:highlight w:val="yellow"/>
-          <w:highlightCs w:val="yellow"/>
         </w:rPr>
         <w:t xml:space="preserve">[должность — уточнить]</w:t>
       </w:r>
@@ -1798,7 +1795,6 @@
           <w:sz w:val="28"/>
           <w:szCs w:val="28"/>
           <w:highlight w:val="yellow"/>
-          <w:highlightCs w:val="yellow"/>
         </w:rPr>
         <w:t xml:space="preserve">13</w:t>
       </w:r>
@@ -1816,7 +1812,6 @@
           <w:sz w:val="28"/>
           <w:szCs w:val="28"/>
           <w:highlight w:val="yellow"/>
-          <w:highlightCs w:val="yellow"/>
         </w:rPr>
         <w:t xml:space="preserve">3</w:t>
       </w:r>
@@ -1834,7 +1829,6 @@
           <w:sz w:val="28"/>
           <w:szCs w:val="28"/>
           <w:highlight w:val="yellow"/>
-          <w:highlightCs w:val="yellow"/>
         </w:rPr>
         <w:t xml:space="preserve">5</w:t>
       </w:r>
@@ -1852,7 +1846,6 @@
           <w:sz w:val="28"/>
           <w:szCs w:val="28"/>
           <w:highlight w:val="yellow"/>
-          <w:highlightCs w:val="yellow"/>
         </w:rPr>
         <w:t xml:space="preserve">3</w:t>
       </w:r>

</xml_diff>